<commit_message>
refactor: Update conclusion section with informal language for better accessibility
- Changed section 5 (Pitch de Conclusión) from formal academic tone to very informal/colloquial
- Maintains all technical arguments and analysis but uses conversational, teen-friendly language
- Makes the content more relatable while preserving the educational content
- Uses natural expressions as if explaining to a classmate
- Document remains max 2 pages as per specifications
</commit_message>
<xml_diff>
--- a/examples/analysis-templates/Analisis_Love_Story_Ejemplo.docx
+++ b/examples/analysis-templates/Analisis_Love_Story_Ejemplo.docx
@@ -310,18 +310,19 @@
     </w:p>
     <w:p>
       <w:r>
-        <w:t xml:space="preserve">"Love Story" es una adaptación brillante pero controvertida de Romeo y Julieta. Aunque mantiene fielmente la estructura narrativa y los arquetipos de personajes shakespearianos, transforma radicalmente el sentido moral de la obra mediante una mutación deliberada del final. </w:t>
-      </w:r>
-      <w:r>
-        <w:t>Mientras que Shakespeare escribía una tragedia sobre la inevitabilidad del destino y el poder destructivo del odio familial, Swift presenta una fantasía optimista donde el amor romántico triunfa sin consecuencias.</w:t>
+        <w:t>Entonces, ¿qué onda con 'Love Story'? Básicamente, Taylor Swift agarra a Romeo y Julieta y dice: "Nah, les hago el final feliz". Y mira, está bien, ¿viste? Es una adaptación porque sí mantiene toda la estructura y los personajes de Shakespeare. Dos locos enamorados, las familias haciéndose los amargos, el drama todo. Eso está ahí.</w:t>
       </w:r>
       <w:r>
         <w:br/>
-        <w:t>Desde una perspectiva técnica, esta es una adaptación exitosa porque logra transponer una obra del siglo XVI al contexto contemporáneo de forma coherente y emocionante. Sin embargo, desde una perspectiva textual, podría argumentarse que la mutación del final es tan fundamental que crea una obra completamente nueva que solo toma prestados elementos superficiales de la original.</w:t>
+        <w:t>Pero lo que pasa es que cambió todo el rollo del final. O sea, Shakespeare escribía una tragedia donde al final mueren los dos, y era tipo "eso, el destino es cruel, la vida es una porquería". Taylor en cambio dice: "Nah, estos dos se casan y viven felices para siempre". Es como darle un plot twist gigante a toda la cosa.</w:t>
       </w:r>
       <w:r>
         <w:br/>
-        <w:t>En conclusión: es una adaptación exitosa en la forma, pero una subversión exitosa en el contenido ideológico.</w:t>
+        <w:t>Así que sí, es una adaptación exitosa porque la modernizó banda, la hizo más light, más "teen romance" y la metió en el contexto del 2008. Pero también es tipo... ¿de verdad sigue siendo Romeo y Julieta si no tiene la tragedia? Es como pedirle al Shakespeare que cambie el final de su obra para que sea más optimista. Está raro, pero funciona.</w:t>
+      </w:r>
+      <w:r>
+        <w:br/>
+        <w:t>En conclusión: es una adaptación exitosa a nivel técnico, pero moralmente es totalmente otra cosa. Shakespeare estaría tipo "¿pero qué pasó con mi obra?" jajaja. Pero bueno, al menos la gente prefiere el final feliz de Taylor, ¿verdad?</w:t>
       </w:r>
     </w:p>
     <w:sectPr>

</xml_diff>

<commit_message>
refactor: Update conclusion to conversational-academic tone
- Changed section 5 (Pitch de Conclusión) from very informal to conversational but academic
- Maintains rigorous analytical content while using accessible, direct language
- Presents arguments as dialogue with the reader rather than formal exposition
- Uses shorter sentences and more natural structure
- Balances scholarly approach with readability for university students
</commit_message>
<xml_diff>
--- a/examples/analysis-templates/Analisis_Love_Story_Ejemplo.docx
+++ b/examples/analysis-templates/Analisis_Love_Story_Ejemplo.docx
@@ -310,19 +310,19 @@
     </w:p>
     <w:p>
       <w:r>
-        <w:t>Entonces, ¿qué onda con 'Love Story'? Básicamente, Taylor Swift agarra a Romeo y Julieta y dice: "Nah, les hago el final feliz". Y mira, está bien, ¿viste? Es una adaptación porque sí mantiene toda la estructura y los personajes de Shakespeare. Dos locos enamorados, las familias haciéndose los amargos, el drama todo. Eso está ahí.</w:t>
+        <w:t>En definitiva, "Love Story" representa un caso fascinante de adaptación contemporánea. Taylor Swift logra transponer la narrativa de Shakespeare a un contexto actual de manera coherente, manteniendo los elementos estructurales clave: dos personajes enamorados, familias opuestas, y el conflicto externo que amenaza su relación. Desde esta perspectiva, la adaptación es exitosa porque funciona como una versión accesible y modernizada de la obra clásica.</w:t>
       </w:r>
       <w:r>
         <w:br/>
-        <w:t>Pero lo que pasa es que cambió todo el rollo del final. O sea, Shakespeare escribía una tragedia donde al final mueren los dos, y era tipo "eso, el destino es cruel, la vida es una porquería". Taylor en cambio dice: "Nah, estos dos se casan y viven felices para siempre". Es como darle un plot twist gigante a toda la cosa.</w:t>
+        <w:t>Sin embargo, hay un aspecto fundamental que cambia radicalmente: el desenlace. Shakespeare nos presenta una tragedia inevitable donde el amor no puede triunfar ante las fuerzas externas. Taylor Swift, por el contrario, nos ofrece una narrativa de esperanza donde el amor vence todos los obstáculos. Esta mutación es tan significativa que transforma el mensaje ético de la obra original.</w:t>
       </w:r>
       <w:r>
         <w:br/>
-        <w:t>Así que sí, es una adaptación exitosa porque la modernizó banda, la hizo más light, más "teen romance" y la metió en el contexto del 2008. Pero también es tipo... ¿de verdad sigue siendo Romeo y Julieta si no tiene la tragedia? Es como pedirle al Shakespeare que cambie el final de su obra para que sea más optimista. Está raro, pero funciona.</w:t>
+        <w:t>Por lo tanto, podríamos argumentar que "Love Story" es una adaptación exitosa a nivel formal, pero que representa una reinterpretación ideológica de la obra original. No es simplemente una versión moderna de Romeo y Julieta, sino más bien una respuesta a ella, una corrección del final trágico de Shakespeare. Lo interesante es que esta decisión creativa no disminuye el valor de la adaptación, sino que la convierte en un diálogo con la obra original, cuestionando sus presupuestos sobre el destino inevitable.</w:t>
       </w:r>
       <w:r>
         <w:br/>
-        <w:t>En conclusión: es una adaptación exitosa a nivel técnico, pero moralmente es totalmente otra cosa. Shakespeare estaría tipo "¿pero qué pasó con mi obra?" jajaja. Pero bueno, al menos la gente prefiere el final feliz de Taylor, ¿verdad?</w:t>
+        <w:t>En conclusión: es una adaptación brillante que funciona tanto como homenaje como subversión de su fuente original.</w:t>
       </w:r>
     </w:p>
     <w:sectPr>

</xml_diff>

<commit_message>
refactor: Update conclusion to formal but accessible tone
- Changed section 5 (Pitch de Conclusión) to formal but non-expert language
- Uses professional structure and vocabulary without technical jargon
- Presents clear arguments with proper transitions
- Maintains academic rigor while remaining accessible to university students
- Balances formality with readability
</commit_message>
<xml_diff>
--- a/examples/analysis-templates/Analisis_Love_Story_Ejemplo.docx
+++ b/examples/analysis-templates/Analisis_Love_Story_Ejemplo.docx
@@ -310,19 +310,19 @@
     </w:p>
     <w:p>
       <w:r>
-        <w:t>En definitiva, "Love Story" representa un caso fascinante de adaptación contemporánea. Taylor Swift logra transponer la narrativa de Shakespeare a un contexto actual de manera coherente, manteniendo los elementos estructurales clave: dos personajes enamorados, familias opuestas, y el conflicto externo que amenaza su relación. Desde esta perspectiva, la adaptación es exitosa porque funciona como una versión accesible y modernizada de la obra clásica.</w:t>
+        <w:t>"Love Story" constituye una adaptación efectiva de Romeo y Julieta al contexto contemporáneo. La canción mantiene los elementos estructurales fundamentales de la obra original: dos personajes principales enamorados, la existencia de familias opuestas, y un conflicto externo que amenaza la continuidad de su relación. Desde esta perspectiva, la adaptación logra su objetivo de transponer una obra clásica a una audiencia moderna de manera coherente y accesible.</w:t>
       </w:r>
       <w:r>
         <w:br/>
-        <w:t>Sin embargo, hay un aspecto fundamental que cambia radicalmente: el desenlace. Shakespeare nos presenta una tragedia inevitable donde el amor no puede triunfar ante las fuerzas externas. Taylor Swift, por el contrario, nos ofrece una narrativa de esperanza donde el amor vence todos los obstáculos. Esta mutación es tan significativa que transforma el mensaje ético de la obra original.</w:t>
+        <w:t>Sin embargo, es necesario destacar un cambio significativo en el mensaje general de la obra. En Shakespeare, la tragedia es inevitable: el amor de Romeo y Julieta no puede prosperar frente a las fuerzas externas que se oponen. Taylor Swift, por el contrario, presenta un final diferente donde el amor triunfa sobre los obstáculos familiares. Esta diferencia no es menor, ya que transforma completamente el mensaje ético de la narrativa original.</w:t>
       </w:r>
       <w:r>
         <w:br/>
-        <w:t>Por lo tanto, podríamos argumentar que "Love Story" es una adaptación exitosa a nivel formal, pero que representa una reinterpretación ideológica de la obra original. No es simplemente una versión moderna de Romeo y Julieta, sino más bien una respuesta a ella, una corrección del final trágico de Shakespeare. Lo interesante es que esta decisión creativa no disminuye el valor de la adaptación, sino que la convierte en un diálogo con la obra original, cuestionando sus presupuestos sobre el destino inevitable.</w:t>
+        <w:t>Esta mutación del desenlace sugiere una reinterpretación consciente de los temas shakespearianos. Donde Shakespeare sugiere que el destino es inevitable y el amor es trágico, Taylor Swift propone que el amor verdadero puede vencer las barreras sociales. Ambas visiones tienen validez narrativa, pero representan filosofías distintas sobre la naturaleza del amor y el destino.</w:t>
       </w:r>
       <w:r>
         <w:br/>
-        <w:t>En conclusión: es una adaptación brillante que funciona tanto como homenaje como subversión de su fuente original.</w:t>
+        <w:t>En conclusión, "Love Story" es una adaptación exitosa que funciona como homenaje modernizado a la obra original, pero también como una respuesta deliberada a sus presupuestos filosóficos. Esta característica la convierte en más que una simple versión contemporánea: es un diálogo creativo con la fuente original.</w:t>
       </w:r>
     </w:p>
     <w:sectPr>

</xml_diff>